<commit_message>
CLBI v1.1: final review fixes (NIC parsing, price framing, naming caution, note updates)
Co-Authored-By: Claude Opus 5.5 <noreply@anthropic.com>
Claude-Session: https://claude.ai/code/session_01AxExFrMdhL6ZckFEdaVFbP
</commit_message>
<xml_diff>
--- a/docs/downloads/CLBI_v1.1_Methodology_Note.docx
+++ b/docs/downloads/CLBI_v1.1_Methodology_Note.docx
@@ -21,6 +21,24 @@
           <w:b/>
         </w:rPr>
         <w:t xml:space="preserve">Draft for Landstack · Urvara.Life · 27 October 2026 · For discussion, not for publication</w:t>
+      </w:r>
+    </w:p>
+    <w:p>
+      <w:pPr>
+        <w:pStyle w:val="BodyText"/>
+      </w:pPr>
+      <w:r>
+        <w:t xml:space="preserve">Website, with every company and every value:</w:t>
+      </w:r>
+      <w:r>
+        <w:t xml:space="preserve"> </w:t>
+      </w:r>
+      <w:r>
+        <w:rPr>
+          <w:bCs/>
+          <w:b/>
+        </w:rPr>
+        <w:t xml:space="preserve">vinaybale-collab.github.io/clbi</w:t>
       </w:r>
     </w:p>
     <w:bookmarkStart w:id="20" w:name="in-one-paragraph"/>
@@ -2076,7 +2094,13 @@
           <w:bCs/>
           <w:b/>
         </w:rPr>
-        <w:t xml:space="preserve">Where the 1,897 values used come from:</w:t>
+        <w:t xml:space="preserve">Where the 1,897 core values recorded for the 500 companies come from</w:t>
+      </w:r>
+      <w:r>
+        <w:t xml:space="preserve"> </w:t>
+      </w:r>
+      <w:r>
+        <w:t xml:space="preserve">(1,592 of them enter a rank):</w:t>
       </w:r>
     </w:p>
     <w:tbl>
@@ -3478,7 +3502,7 @@
         <w:pStyle w:val="Compact"/>
       </w:pPr>
       <w:r>
-        <w:t xml:space="preserve">The largest effect is 5 places, in Healthcare.</w:t>
+        <w:t xml:space="preserve">The largest effect is 5 places, in Capital Goods and Healthcare.</w:t>
       </w:r>
     </w:p>
     <w:p>
@@ -3502,7 +3526,7 @@
         <w:pStyle w:val="Compact"/>
       </w:pPr>
       <w:r>
-        <w:t xml:space="preserve">Rank order with and without credit is almost identical in every group (rank correlation 0.99 or higher).</w:t>
+        <w:t xml:space="preserve">Rank order with and without credit is almost identical in every group (rank correlation 0.98 or higher).</w:t>
       </w:r>
     </w:p>
     <w:p>
@@ -3550,7 +3574,7 @@
         <w:t xml:space="preserve"> </w:t>
       </w:r>
       <w:r>
-        <w:t xml:space="preserve">all 10 pure cement companies have production data. Their per-tonne ranks are shown as the headline cement view, next to the revenue rank, and the two agree closely (rank correlation 0.92). Grasim is left out of this view because its standalone business is mainly fibres and chemicals.</w:t>
+        <w:t xml:space="preserve">all 10 pure cement companies have production data. Their per-tonne ranks are shown alongside the revenue rank, and the two agree closely (rank correlation 0.92). Grasim is left out of this view because its standalone business is mainly fibres and chemicals.</w:t>
       </w:r>
     </w:p>
     <w:p>
@@ -3935,7 +3959,7 @@
         <w:t xml:space="preserve"> </w:t>
       </w:r>
       <w:r>
-        <w:t xml:space="preserve">36 ranked companies carry a</w:t>
+        <w:t xml:space="preserve">32 ranked companies carry a</w:t>
       </w:r>
       <w:r>
         <w:t xml:space="preserve"> </w:t>
@@ -3953,7 +3977,7 @@
         <w:t xml:space="preserve"> </w:t>
       </w:r>
       <w:r>
-        <w:t xml:space="preserve">flag. Either their business is not like-for-like with their peers, or one of their scored values is 100–300 times from the peer median: inside the hold-back line, but unusual. Their rank stands, but they should not be singled out, for example as a sector leader, until the value is checked with the company.</w:t>
+        <w:t xml:space="preserve">flag. Either their business is not like-for-like with their peers, or one of their scored climate, water or waste values is 100–300 times from the peer median: inside the hold-back line, but unusual. Their rank stands, but they should not be singled out, for example as a sector leader, until the value is checked with the company.</w:t>
       </w:r>
     </w:p>
     <w:p>
@@ -3975,7 +3999,7 @@
         <w:t xml:space="preserve"> </w:t>
       </w:r>
       <w:r>
-        <w:t xml:space="preserve">286 ranked companies report their BRSR on a standalone basis and 86 on a consolidated basis, sometimes within the same peer group. Revenue always matches the company’s own BRSR basis.</w:t>
+        <w:t xml:space="preserve">286 ranked companies report their BRSR on a standalone basis and 86 on a consolidated basis, sometimes within the same peer group (1 does not state its basis). Revenue always matches the company’s own BRSR basis.</w:t>
       </w:r>
     </w:p>
     <w:p>
@@ -4387,7 +4411,7 @@
         <w:pStyle w:val="FirstParagraph"/>
       </w:pPr>
       <w:r>
-        <w:t xml:space="preserve">Every value is listed in the dataset and on the website with its source. A company that thinks a value is wrong can send a correction with the page reference in its published report. Corrections are applied only where they match a public document, and every change is logged.</w:t>
+        <w:t xml:space="preserve">Every value is listed in the dataset and on the website (vinaybale-collab.github.io/clbi) with its source. A company that thinks a value is wrong can send a correction with the page reference in its published report. Corrections are applied only where they match a public document, and every change is logged.</w:t>
       </w:r>
     </w:p>
     <w:p>
@@ -5198,7 +5222,7 @@
         <w:pStyle w:val="Compact"/>
       </w:pPr>
       <w:r>
-        <w:t xml:space="preserve">power ≈ 120%;</w:t>
+        <w:t xml:space="preserve">power ≈ 120% (thermal generators far higher; hydro, solar and transmission below 5%);</w:t>
       </w:r>
     </w:p>
     <w:p>
@@ -5234,7 +5258,7 @@
         <w:pStyle w:val="Compact"/>
       </w:pPr>
       <w:r>
-        <w:t xml:space="preserve">chemicals ≈ 17%;</w:t>
+        <w:t xml:space="preserve">chemicals ≈ 16.5%;</w:t>
       </w:r>
     </w:p>
     <w:p>

</xml_diff>